<commit_message>
Implement Version 3 paid plans and MVP hardening
</commit_message>
<xml_diff>
--- a/project_upgrade_document/Version 03/uMshova_Dealuxe_Hybrid_Upgrade_Version_3.docx
+++ b/project_upgrade_document/Version 03/uMshova_Dealuxe_Hybrid_Upgrade_Version_3.docx
@@ -87,19 +87,7 @@
         <w:spacing w:after="60"/>
       </w:pPr>
       <w:r>
-        <w:rPr>
-          <w:rFonts w:ascii="Calibri" w:hAnsi="Calibri"/>
-          <w:b/>
-          <w:color w:val="781C2E"/>
-        </w:rPr>
-        <w:t xml:space="preserve">Date: </w:t>
-      </w:r>
-      <w:r>
-        <w:rPr>
-          <w:rFonts w:ascii="Calibri" w:hAnsi="Calibri"/>
-          <w:color w:val="242424"/>
-        </w:rPr>
-        <w:t>22 August 2026</w:t>
+        <w:t>Date: 2 September 2026</w:t>
       </w:r>
     </w:p>
     <w:p>
@@ -127,19 +115,7 @@
         <w:spacing w:after="60"/>
       </w:pPr>
       <w:r>
-        <w:rPr>
-          <w:rFonts w:ascii="Calibri" w:hAnsi="Calibri"/>
-          <w:b/>
-          <w:color w:val="781C2E"/>
-        </w:rPr>
-        <w:t xml:space="preserve">Status: </w:t>
-      </w:r>
-      <w:r>
-        <w:rPr>
-          <w:rFonts w:ascii="Calibri" w:hAnsi="Calibri"/>
-          <w:color w:val="242424"/>
-        </w:rPr>
-        <w:t>Concept validation and implementation planning</w:t>
+        <w:t>Status: Version 3 MVP implementation - E20 Hybrid and E40 Hybrid+ paid-plan activation completed; E60 Premium gated pending approved openWA delivery</w:t>
       </w:r>
     </w:p>
     <w:p>
@@ -518,7 +494,7 @@
         </w:numPr>
       </w:pPr>
       <w:r>
-        <w:t>The initial release should validate user value before paid entitlements are activated.</w:t>
+        <w:t>The controlled pilot validated the core Hybrid layer. Paid activation is now implemented behind default-off administrator and environment switches so the team can enable or stop new sales without changing code.</w:t>
       </w:r>
     </w:p>
     <w:p>
@@ -3686,17 +3662,7 @@
             <w:vAlign w:val="center"/>
           </w:tcPr>
           <w:p>
-            <w:pPr>
-              <w:widowControl/>
-              <w:spacing w:after="0"/>
-            </w:pPr>
             <w:r>
-              <w:rPr>
-                <w:rFonts w:ascii="Calibri" w:hAnsi="Calibri"/>
-                <w:b/>
-                <w:color w:val="781C2E"/>
-                <w:sz w:val="19"/>
-              </w:rPr>
               <w:t>Plan</w:t>
             </w:r>
           </w:p>
@@ -3714,18 +3680,8 @@
             <w:vAlign w:val="center"/>
           </w:tcPr>
           <w:p>
-            <w:pPr>
-              <w:widowControl/>
-              <w:spacing w:after="0"/>
-            </w:pPr>
             <w:r>
-              <w:rPr>
-                <w:rFonts w:ascii="Calibri" w:hAnsi="Calibri"/>
-                <w:b/>
-                <w:color w:val="781C2E"/>
-                <w:sz w:val="19"/>
-              </w:rPr>
-              <w:t>Proposed price</w:t>
+              <w:t>MVP price</w:t>
             </w:r>
           </w:p>
         </w:tc>
@@ -3742,17 +3698,7 @@
             <w:vAlign w:val="center"/>
           </w:tcPr>
           <w:p>
-            <w:pPr>
-              <w:widowControl/>
-              <w:spacing w:after="0"/>
-            </w:pPr>
             <w:r>
-              <w:rPr>
-                <w:rFonts w:ascii="Calibri" w:hAnsi="Calibri"/>
-                <w:b/>
-                <w:color w:val="781C2E"/>
-                <w:sz w:val="19"/>
-              </w:rPr>
               <w:t>Core entitlement</w:t>
             </w:r>
           </w:p>
@@ -3771,17 +3717,8 @@
             <w:vAlign w:val="center"/>
           </w:tcPr>
           <w:p>
-            <w:pPr>
-              <w:widowControl/>
-              <w:spacing w:after="0" w:line="252" w:lineRule="auto"/>
-            </w:pPr>
             <w:r>
-              <w:rPr>
-                <w:rFonts w:ascii="Calibri" w:hAnsi="Calibri"/>
-                <w:color w:val="242424"/>
-                <w:sz w:val="18"/>
-              </w:rPr>
-              <w:t>Passive marketing</w:t>
+              <w:t>Free Seeker</w:t>
             </w:r>
           </w:p>
         </w:tc>
@@ -3797,17 +3734,8 @@
             <w:vAlign w:val="center"/>
           </w:tcPr>
           <w:p>
-            <w:pPr>
-              <w:widowControl/>
-              <w:spacing w:after="0" w:line="252" w:lineRule="auto"/>
-            </w:pPr>
             <w:r>
-              <w:rPr>
-                <w:rFonts w:ascii="Calibri" w:hAnsi="Calibri"/>
-                <w:color w:val="242424"/>
-                <w:sz w:val="18"/>
-              </w:rPr>
-              <w:t>Free</w:t>
+              <w:t>E0</w:t>
             </w:r>
           </w:p>
         </w:tc>
@@ -3823,17 +3751,8 @@
             <w:vAlign w:val="center"/>
           </w:tcPr>
           <w:p>
-            <w:pPr>
-              <w:widowControl/>
-              <w:spacing w:after="0" w:line="252" w:lineRule="auto"/>
-            </w:pPr>
             <w:r>
-              <w:rPr>
-                <w:rFonts w:ascii="Calibri" w:hAnsi="Calibri"/>
-                <w:color w:val="242424"/>
-                <w:sz w:val="18"/>
-              </w:rPr>
-              <w:t>Caption visibility to naturally assigned opponents; no intent-based bracket matching.</w:t>
+              <w:t>Consent-based seeker visibility, Cup qualification eligibility, multigame brackets and universal referral access.</w:t>
             </w:r>
           </w:p>
         </w:tc>
@@ -3852,17 +3771,8 @@
             <w:vAlign w:val="center"/>
           </w:tcPr>
           <w:p>
-            <w:pPr>
-              <w:widowControl/>
-              <w:spacing w:after="0" w:line="252" w:lineRule="auto"/>
-            </w:pPr>
             <w:r>
-              <w:rPr>
-                <w:rFonts w:ascii="Calibri" w:hAnsi="Calibri"/>
-                <w:color w:val="242424"/>
-                <w:sz w:val="18"/>
-              </w:rPr>
-              <w:t>Active marketing</w:t>
+              <w:t>Hybrid</w:t>
             </w:r>
           </w:p>
         </w:tc>
@@ -3879,17 +3789,8 @@
             <w:vAlign w:val="center"/>
           </w:tcPr>
           <w:p>
-            <w:pPr>
-              <w:widowControl/>
-              <w:spacing w:after="0" w:line="252" w:lineRule="auto"/>
-            </w:pPr>
             <w:r>
-              <w:rPr>
-                <w:rFonts w:ascii="Calibri" w:hAnsi="Calibri"/>
-                <w:color w:val="242424"/>
-                <w:sz w:val="18"/>
-              </w:rPr>
-              <w:t>E20 per week</w:t>
+              <w:t>E20 / 7-day pass</w:t>
             </w:r>
           </w:p>
         </w:tc>
@@ -3906,17 +3807,8 @@
             <w:vAlign w:val="center"/>
           </w:tcPr>
           <w:p>
-            <w:pPr>
-              <w:widowControl/>
-              <w:spacing w:after="0" w:line="252" w:lineRule="auto"/>
-            </w:pPr>
             <w:r>
-              <w:rPr>
-                <w:rFonts w:ascii="Calibri" w:hAnsi="Calibri"/>
-                <w:color w:val="242424"/>
-                <w:sz w:val="18"/>
-              </w:rPr>
-              <w:t>Commercial match matching within an existing bracket, subject to compatible users being present.</w:t>
+              <w:t>Potential relevant seller/seeker matching inside the bracket already joined.</w:t>
             </w:r>
           </w:p>
         </w:tc>
@@ -3934,17 +3826,8 @@
             <w:vAlign w:val="center"/>
           </w:tcPr>
           <w:p>
-            <w:pPr>
-              <w:widowControl/>
-              <w:spacing w:after="0" w:line="252" w:lineRule="auto"/>
-            </w:pPr>
             <w:r>
-              <w:rPr>
-                <w:rFonts w:ascii="Calibri" w:hAnsi="Calibri"/>
-                <w:color w:val="242424"/>
-                <w:sz w:val="18"/>
-              </w:rPr>
-              <w:t>Boosted active marketing</w:t>
+              <w:t>Hybrid+</w:t>
             </w:r>
           </w:p>
         </w:tc>
@@ -3960,17 +3843,8 @@
             <w:vAlign w:val="center"/>
           </w:tcPr>
           <w:p>
-            <w:pPr>
-              <w:widowControl/>
-              <w:spacing w:after="0" w:line="252" w:lineRule="auto"/>
-            </w:pPr>
             <w:r>
-              <w:rPr>
-                <w:rFonts w:ascii="Calibri" w:hAnsi="Calibri"/>
-                <w:color w:val="242424"/>
-                <w:sz w:val="18"/>
-              </w:rPr>
-              <w:t>E40 per week</w:t>
+              <w:t>E40 / 7-day pass</w:t>
             </w:r>
           </w:p>
         </w:tc>
@@ -3986,17 +3860,8 @@
             <w:vAlign w:val="center"/>
           </w:tcPr>
           <w:p>
-            <w:pPr>
-              <w:widowControl/>
-              <w:spacing w:after="0" w:line="252" w:lineRule="auto"/>
-            </w:pPr>
             <w:r>
-              <w:rPr>
-                <w:rFonts w:ascii="Calibri" w:hAnsi="Calibri"/>
-                <w:color w:val="242424"/>
-                <w:sz w:val="18"/>
-              </w:rPr>
-              <w:t>Higher-intelligence bracket discovery/matching for open brackets, plus active matching.</w:t>
+              <w:t>Hybrid access plus privacy-safe discovery of relevant eligible open brackets before joining.</w:t>
             </w:r>
           </w:p>
         </w:tc>
@@ -4015,17 +3880,8 @@
             <w:vAlign w:val="center"/>
           </w:tcPr>
           <w:p>
-            <w:pPr>
-              <w:widowControl/>
-              <w:spacing w:after="0" w:line="252" w:lineRule="auto"/>
-            </w:pPr>
             <w:r>
-              <w:rPr>
-                <w:rFonts w:ascii="Calibri" w:hAnsi="Calibri"/>
-                <w:color w:val="242424"/>
-                <w:sz w:val="18"/>
-              </w:rPr>
-              <w:t>Relationship matching</w:t>
+              <w:t>Premium</w:t>
             </w:r>
           </w:p>
         </w:tc>
@@ -4042,17 +3898,8 @@
             <w:vAlign w:val="center"/>
           </w:tcPr>
           <w:p>
-            <w:pPr>
-              <w:widowControl/>
-              <w:spacing w:after="0" w:line="252" w:lineRule="auto"/>
-            </w:pPr>
             <w:r>
-              <w:rPr>
-                <w:rFonts w:ascii="Calibri" w:hAnsi="Calibri"/>
-                <w:color w:val="242424"/>
-                <w:sz w:val="18"/>
-              </w:rPr>
-              <w:t>E60 per month</w:t>
+              <w:t>E60 / 7-day pass</w:t>
             </w:r>
           </w:p>
         </w:tc>
@@ -4069,17 +3916,8 @@
             <w:vAlign w:val="center"/>
           </w:tcPr>
           <w:p>
-            <w:pPr>
-              <w:widowControl/>
-              <w:spacing w:after="0" w:line="252" w:lineRule="auto"/>
-            </w:pPr>
             <w:r>
-              <w:rPr>
-                <w:rFonts w:ascii="Calibri" w:hAnsi="Calibri"/>
-                <w:color w:val="242424"/>
-                <w:sz w:val="18"/>
-              </w:rPr>
-              <w:t>Restricted relationship captions and reciprocal matching among opted-in eligible adults.</w:t>
+              <w:t>Hybrid+ plus opted-in open-bracket alerts through openWA. Sale remains locked until the approved live alert adapter exists.</w:t>
             </w:r>
           </w:p>
         </w:tc>
@@ -4097,17 +3935,8 @@
             <w:vAlign w:val="center"/>
           </w:tcPr>
           <w:p>
-            <w:pPr>
-              <w:widowControl/>
-              <w:spacing w:after="0" w:line="252" w:lineRule="auto"/>
-            </w:pPr>
             <w:r>
-              <w:rPr>
-                <w:rFonts w:ascii="Calibri" w:hAnsi="Calibri"/>
-                <w:color w:val="242424"/>
-                <w:sz w:val="18"/>
-              </w:rPr>
-              <w:t>Custom caption</w:t>
+              <w:t>Referral reward</w:t>
             </w:r>
           </w:p>
         </w:tc>
@@ -4123,17 +3952,8 @@
             <w:vAlign w:val="center"/>
           </w:tcPr>
           <w:p>
-            <w:pPr>
-              <w:widowControl/>
-              <w:spacing w:after="0" w:line="252" w:lineRule="auto"/>
-            </w:pPr>
             <w:r>
-              <w:rPr>
-                <w:rFonts w:ascii="Calibri" w:hAnsi="Calibri"/>
-                <w:color w:val="242424"/>
-                <w:sz w:val="18"/>
-              </w:rPr>
-              <w:t>Price to be approved</w:t>
+              <w:t>E10 promotional credit</w:t>
             </w:r>
           </w:p>
         </w:tc>
@@ -4149,17 +3969,8 @@
             <w:vAlign w:val="center"/>
           </w:tcPr>
           <w:p>
-            <w:pPr>
-              <w:widowControl/>
-              <w:spacing w:after="0" w:line="252" w:lineRule="auto"/>
-            </w:pPr>
             <w:r>
-              <w:rPr>
-                <w:rFonts w:ascii="Calibri" w:hAnsi="Calibri"/>
-                <w:color w:val="242424"/>
-                <w:sz w:val="18"/>
-              </w:rPr>
-              <w:t>User-written caption rather than a predefined template, subject to moderation.</w:t>
+              <w:t>Available on every plan after the referred active user completes a first valid ordinary tournament; awarded once and non-withdrawable.</w:t>
             </w:r>
           </w:p>
         </w:tc>
@@ -4187,7 +3998,7 @@
         </w:numPr>
       </w:pPr>
       <w:r>
-        <w:t>Users may subscribe to both commercial matching and relationship matching at the same time.</w:t>
+        <w:t>Referral access remains universal on every plan. Paid commercial access uses non-renewing passes; the highest active entitlement determines matching access.</w:t>
       </w:r>
     </w:p>
     <w:p>
@@ -4199,7 +4010,7 @@
         </w:numPr>
       </w:pPr>
       <w:r>
-        <w:t>Entitlements may be upgraded at any time. The initial proposal states that payments are non-refundable; final terms must be clearly disclosed before purchase and reviewed for applicable consumer law.</w:t>
+        <w:t>Users may upgrade by purchasing a higher pass. Repeated purchases extend the same plan from its current expiry. Public refund, cancellation, tax and receipt terms still require owner and legal approval before public monetisation.</w:t>
       </w:r>
     </w:p>
     <w:p>
@@ -4235,7 +4046,7 @@
         </w:numPr>
       </w:pPr>
       <w:r>
-        <w:t>Pricing periods, renewal behaviour, expiry time, taxes, grace periods and cancellation handling must be defined before payment integration.</w:t>
+        <w:t>MVP prices and durations are configurable: E20 Hybrid, E40 Hybrid+ and E60 Premium are seven-day non-renewing passes by default. Premium cannot be sold until its approved openWA alert benefit is live.</w:t>
       </w:r>
     </w:p>
     <w:p>
@@ -7381,10 +7192,7 @@
     </w:p>
     <w:p>
       <w:r>
-        <w:rPr>
-          <w:rFonts w:ascii="Calibri" w:hAnsi="Calibri"/>
-        </w:rPr>
-        <w:t>The original milestone sequence is sound, with one adjustment: requirements, safety rules and feature boundaries should be agreed before algorithm implementation. Payment should remain disabled during the first functional pilot.</w:t>
+        <w:t>The staged milestone sequence remains authoritative. Payment activation is default off and controlled independently from the Hybrid capability switches; turning off a required capability immediately stops sales of that benefit.</w:t>
       </w:r>
     </w:p>
     <w:tbl>
@@ -7992,17 +7800,8 @@
             <w:vAlign w:val="center"/>
           </w:tcPr>
           <w:p>
-            <w:pPr>
-              <w:widowControl/>
-              <w:spacing w:after="0" w:line="252" w:lineRule="auto"/>
-            </w:pPr>
             <w:r>
-              <w:rPr>
-                <w:rFonts w:ascii="Calibri" w:hAnsi="Calibri"/>
-                <w:color w:val="242424"/>
-                <w:sz w:val="18"/>
-              </w:rPr>
-              <w:t>6. Monetisation</w:t>
+              <w:t>6. Monetisation - E20/E40 complete</w:t>
             </w:r>
           </w:p>
         </w:tc>
@@ -8018,17 +7817,8 @@
             <w:vAlign w:val="center"/>
           </w:tcPr>
           <w:p>
-            <w:pPr>
-              <w:widowControl/>
-              <w:spacing w:after="0" w:line="252" w:lineRule="auto"/>
-            </w:pPr>
             <w:r>
-              <w:rPr>
-                <w:rFonts w:ascii="Calibri" w:hAnsi="Calibri"/>
-                <w:color w:val="242424"/>
-                <w:sz w:val="18"/>
-              </w:rPr>
-              <w:t>Payments, subscriptions, expiry, renewals, pricing UI, receipts and terms.</w:t>
+              <w:t>Configurable plan sales, gateway initiation, callbacks, persistent purchases, expiring entitlements, account purchase UI and administrator controls.</w:t>
             </w:r>
           </w:p>
         </w:tc>
@@ -8044,17 +7834,8 @@
             <w:vAlign w:val="center"/>
           </w:tcPr>
           <w:p>
-            <w:pPr>
-              <w:widowControl/>
-              <w:spacing w:after="0" w:line="252" w:lineRule="auto"/>
-            </w:pPr>
             <w:r>
-              <w:rPr>
-                <w:rFonts w:ascii="Calibri" w:hAnsi="Calibri"/>
-                <w:color w:val="242424"/>
-                <w:sz w:val="18"/>
-              </w:rPr>
-              <w:t>Financial reconciliation and entitlement tests pass.</w:t>
+              <w:t>E20/E40 payment and entitlement regressions pass. Premium remains gated by openWA; public commercial terms and reconciliation remain launch gates.</w:t>
             </w:r>
           </w:p>
         </w:tc>
@@ -8225,7 +8006,7 @@
         </w:numPr>
       </w:pPr>
       <w:r>
-        <w:t>Commercial: trials, activation, expiry, upgrades, combined plans, refunds/cancellations and failed-payment handling.</w:t>
+        <w:t>Commercial: plan availability, payment initiation, exact callback amount and currency, idempotent activation, expiry, extensions, failed payments, entitlement enforcement and referral independence.</w:t>
       </w:r>
     </w:p>
     <w:p>
@@ -9167,7 +8948,7 @@
         </w:numPr>
       </w:pPr>
       <w:r>
-        <w:t>Confirm plan durations, custom-caption price, renewal, cancellation and refund rules.</w:t>
+        <w:t>Approve public tax, refund, cancellation and receipt wording. The MVP currently uses configurable seven-day, non-renewing paid passes.</w:t>
       </w:r>
     </w:p>
     <w:p>
@@ -9179,7 +8960,7 @@
         </w:numPr>
       </w:pPr>
       <w:r>
-        <w:t>Approve adult verification, relationship preference, privacy and moderation policies.</w:t>
+        <w:t>Relationship matching remains outside the Version 3 MVP and requires separate adult-safety, privacy, moderation and legal approval.</w:t>
       </w:r>
     </w:p>
     <w:p>
@@ -9269,6 +9050,62 @@
       <w:pPr>
         <w:spacing w:after="20"/>
       </w:pPr>
+    </w:p>
+    <w:p>
+      <w:pPr>
+        <w:pStyle w:val="Heading2"/>
+      </w:pPr>
+      <w:r>
+        <w:t>12.4 Version 3 implementation checklist snapshot</w:t>
+      </w:r>
+    </w:p>
+    <w:p>
+      <w:pPr>
+        <w:pStyle w:val="ListBullet"/>
+      </w:pPr>
+      <w:r>
+        <w:t>V3-1001 - PARTIAL: configurable seven-day pass terms are defined; public tax, refund, cancellation and receipt wording remains to be approved.</w:t>
+      </w:r>
+    </w:p>
+    <w:p>
+      <w:pPr>
+        <w:pStyle w:val="ListBullet"/>
+      </w:pPr>
+      <w:r>
+        <w:t>V3-1002 - COMPLETE: referral codes are universal and the referrer receives one E10 promotional-credit reward after the referred user completes a first valid ordinary tournament.</w:t>
+      </w:r>
+    </w:p>
+    <w:p>
+      <w:pPr>
+        <w:pStyle w:val="ListBullet"/>
+      </w:pPr>
+      <w:r>
+        <w:t>V3-1003 - COMPLETE: E20 Hybrid purchases, joined-bracket entitlement enforcement, expiry, extension and administrator kill switches are covered.</w:t>
+      </w:r>
+    </w:p>
+    <w:p>
+      <w:pPr>
+        <w:pStyle w:val="ListBullet"/>
+      </w:pPr>
+      <w:r>
+        <w:t>V3-1004 - COMPLETE: E40 Hybrid+ purchases and privacy-safe relevant open-bracket badges are covered without seeker identity or contact disclosure.</w:t>
+      </w:r>
+    </w:p>
+    <w:p>
+      <w:pPr>
+        <w:pStyle w:val="ListBullet"/>
+      </w:pPr>
+      <w:r>
+        <w:t>V3-1005 - GATED: E60 Premium remains non-purchasable until the separately approved live openWA alert benefit is implemented and verified.</w:t>
+      </w:r>
+    </w:p>
+    <w:p>
+      <w:pPr>
+        <w:pStyle w:val="ListBullet"/>
+      </w:pPr>
+      <w:r>
+        <w:t>V3-1006 - COMPLETE FOR MVP CORE: exact SZL payment callbacks, idempotency, failed-payment handling, audit records and recovery coverage are implemented.</w:t>
+      </w:r>
     </w:p>
     <w:sectPr>
       <w:headerReference w:type="default" r:id="rId9"/>

</xml_diff>